<commit_message>
Reescribe la resolución del caso TechNova con redacción de estudiante y agrega PDF
Co-Authored-By: Claude Sonnet 5.5 <noreply@anthropic.com>
Claude-Session: https://claude.ai/code/session_013iWwbBbHxw2c1QtKDe5PjZ
</commit_message>
<xml_diff>
--- a/Caso_TechNova_Resuelto.docx
+++ b/Caso_TechNova_Resuelto.docx
@@ -31,7 +31,7 @@
           <w:sz w:val="24"/>
           <w:szCs w:val="24"/>
         </w:rPr>
-        <w:t xml:space="preserve">TechNova S.A. – Resolución</w:t>
+        <w:t xml:space="preserve">TechNova S.A.</w:t>
       </w:r>
     </w:p>
     <w:p>
@@ -45,6 +45,42 @@
           <w:bCs/>
         </w:rPr>
         <w:t xml:space="preserve">1. Resumen del caso</w:t>
+      </w:r>
+    </w:p>
+    <w:p>
+      <w:pPr>
+        <w:spacing w:after="100"/>
+      </w:pPr>
+      <w:r>
+        <w:rPr>
+          <w:rFonts w:ascii="Calibri" w:cs="Calibri" w:eastAsia="Calibri" w:hAnsi="Calibri"/>
+        </w:rPr>
+        <w:t xml:space="preserve">TechNova S.A. es una empresa de servicios tecnológicos y consultoría con 250 empleados. Su infraestructura combina servidores internos y en la nube (Azure), ERP y CRM en línea, correo corporativo, Teams y SharePoint. En los últimos dos años creció rápido, pero no hizo auditorías de seguridad ni capacitó a su personal.</w:t>
+      </w:r>
+    </w:p>
+    <w:p>
+      <w:pPr>
+        <w:spacing w:after="100"/>
+      </w:pPr>
+      <w:r>
+        <w:rPr>
+          <w:rFonts w:ascii="Calibri" w:cs="Calibri" w:eastAsia="Calibri" w:hAnsi="Calibri"/>
+        </w:rPr>
+        <w:t xml:space="preserve">En marzo de 2024 sufrió un ataque de </w:t>
+      </w:r>
+      <w:r>
+        <w:rPr>
+          <w:rFonts w:ascii="Calibri" w:cs="Calibri" w:eastAsia="Calibri" w:hAnsi="Calibri"/>
+          <w:b/>
+          <w:bCs/>
+        </w:rPr>
+        <w:t xml:space="preserve">ransomware</w:t>
+      </w:r>
+      <w:r>
+        <w:rPr>
+          <w:rFonts w:ascii="Calibri" w:cs="Calibri" w:eastAsia="Calibri" w:hAnsi="Calibri"/>
+        </w:rPr>
+        <w:t xml:space="preserve">. Todo empezó con un correo de phishing dirigido a contabilidad, que parecía venir de un proveedor habitual e incluía un PDF que ejecutó un script malicioso. El ataque dejó estas consecuencias:</w:t>
       </w:r>
     </w:p>
     <w:p>
@@ -59,16 +95,8 @@
       <w:r>
         <w:rPr>
           <w:rFonts w:ascii="Calibri" w:cs="Calibri" w:eastAsia="Calibri" w:hAnsi="Calibri"/>
-          <w:b/>
-          <w:bCs/>
-        </w:rPr>
-        <w:t xml:space="preserve">Empresa:</w:t>
-      </w:r>
-      <w:r>
-        <w:rPr>
-          <w:rFonts w:ascii="Calibri" w:cs="Calibri" w:eastAsia="Calibri" w:hAnsi="Calibri"/>
-        </w:rPr>
-        <w:t xml:space="preserve"> TechNova S.A. (servicios tecnológicos y consultoría, 250 empleados).</w:t>
+        </w:rPr>
+        <w:t xml:space="preserve">Cifrado del 80 % de los archivos del servidor principal.</w:t>
       </w:r>
     </w:p>
     <w:p>
@@ -83,16 +111,8 @@
       <w:r>
         <w:rPr>
           <w:rFonts w:ascii="Calibri" w:cs="Calibri" w:eastAsia="Calibri" w:hAnsi="Calibri"/>
-          <w:b/>
-          <w:bCs/>
-        </w:rPr>
-        <w:t xml:space="preserve">Infraestructura:</w:t>
-      </w:r>
-      <w:r>
-        <w:rPr>
-          <w:rFonts w:ascii="Calibri" w:cs="Calibri" w:eastAsia="Calibri" w:hAnsi="Calibri"/>
-        </w:rPr>
-        <w:t xml:space="preserve"> servidores internos y en la nube (Azure), ERP y CRM en línea, correo corporativo, Teams y SharePoint.</w:t>
+        </w:rPr>
+        <w:t xml:space="preserve">Pérdida temporal de acceso a las bases de datos de clientes.</w:t>
       </w:r>
     </w:p>
     <w:p>
@@ -107,16 +127,8 @@
       <w:r>
         <w:rPr>
           <w:rFonts w:ascii="Calibri" w:cs="Calibri" w:eastAsia="Calibri" w:hAnsi="Calibri"/>
-          <w:b/>
-          <w:bCs/>
-        </w:rPr>
-        <w:t xml:space="preserve">Problema de fondo:</w:t>
-      </w:r>
-      <w:r>
-        <w:rPr>
-          <w:rFonts w:ascii="Calibri" w:cs="Calibri" w:eastAsia="Calibri" w:hAnsi="Calibri"/>
-        </w:rPr>
-        <w:t xml:space="preserve"> creció muy rápido y no hizo auditorías de seguridad ni capacitó al personal.</w:t>
+        </w:rPr>
+        <w:t xml:space="preserve">Exigencia de un rescate de 15 000 USD en criptomonedas.</w:t>
       </w:r>
     </w:p>
     <w:p>
@@ -131,16 +143,8 @@
       <w:r>
         <w:rPr>
           <w:rFonts w:ascii="Calibri" w:cs="Calibri" w:eastAsia="Calibri" w:hAnsi="Calibri"/>
-          <w:b/>
-          <w:bCs/>
-        </w:rPr>
-        <w:t xml:space="preserve">Incidente (marzo de 2024):</w:t>
-      </w:r>
-      <w:r>
-        <w:rPr>
-          <w:rFonts w:ascii="Calibri" w:cs="Calibri" w:eastAsia="Calibri" w:hAnsi="Calibri"/>
-        </w:rPr>
-        <w:t xml:space="preserve"> ransomware que entró por un correo de phishing al departamento de contabilidad, con un PDF adjunto que ejecutó un script malicioso.</w:t>
+        </w:rPr>
+        <w:t xml:space="preserve">Cinco días de operaciones paralizadas.</w:t>
       </w:r>
     </w:p>
     <w:p>
@@ -155,39 +159,51 @@
       <w:r>
         <w:rPr>
           <w:rFonts w:ascii="Calibri" w:cs="Calibri" w:eastAsia="Calibri" w:hAnsi="Calibri"/>
+        </w:rPr>
+        <w:t xml:space="preserve">Pérdida estimada de 75 000 USD entre costos directos e indirectos.</w:t>
+      </w:r>
+    </w:p>
+    <w:p>
+      <w:pPr>
+        <w:spacing w:after="120" w:before="280"/>
+      </w:pPr>
+      <w:r>
+        <w:rPr>
+          <w:rFonts w:ascii="Calibri" w:cs="Calibri" w:eastAsia="Calibri" w:hAnsi="Calibri"/>
           <w:b/>
           <w:bCs/>
         </w:rPr>
-        <w:t xml:space="preserve">Consecuencias:</w:t>
-      </w:r>
-      <w:r>
-        <w:rPr>
-          <w:rFonts w:ascii="Calibri" w:cs="Calibri" w:eastAsia="Calibri" w:hAnsi="Calibri"/>
-        </w:rPr>
-        <w:t xml:space="preserve"> 80 % de los archivos del servidor principal cifrados, pérdida temporal de las bases de datos de clientes, rescate de 15 000 USD, 5 días de operaciones paralizadas y pérdida estimada de 75 000 USD.</w:t>
+        <w:t xml:space="preserve">2. Identificación del ataque</w:t>
       </w:r>
     </w:p>
     <w:p>
       <w:pPr>
-        <w:spacing w:after="120" w:before="280"/>
-      </w:pPr>
+        <w:spacing w:after="100"/>
+      </w:pPr>
+      <w:r>
+        <w:rPr>
+          <w:rFonts w:ascii="Calibri" w:cs="Calibri" w:eastAsia="Calibri" w:hAnsi="Calibri"/>
+        </w:rPr>
+        <w:t xml:space="preserve">Se trata de un ataque de </w:t>
+      </w:r>
       <w:r>
         <w:rPr>
           <w:rFonts w:ascii="Calibri" w:cs="Calibri" w:eastAsia="Calibri" w:hAnsi="Calibri"/>
           <w:b/>
           <w:bCs/>
         </w:rPr>
-        <w:t xml:space="preserve">2. Identificación del ataque</w:t>
+        <w:t xml:space="preserve">ransomware</w:t>
+      </w:r>
+      <w:r>
+        <w:rPr>
+          <w:rFonts w:ascii="Calibri" w:cs="Calibri" w:eastAsia="Calibri" w:hAnsi="Calibri"/>
+        </w:rPr>
+        <w:t xml:space="preserve"> con ingeniería social como vector de entrada (phishing). La amenaza es un actor externo con motivación económica, y los activos afectados fueron el servidor principal, las bases de datos de clientes, el ERP y CRM, y la continuidad de las operaciones.</w:t>
       </w:r>
     </w:p>
     <w:p>
       <w:pPr>
-        <w:pStyle w:val="ListParagraph"/>
-        <w:numPr>
-          <w:ilvl w:val="0"/>
-          <w:numId w:val="2"/>
-        </w:numPr>
-        <w:spacing w:after="60"/>
+        <w:spacing w:after="80" w:before="160"/>
       </w:pPr>
       <w:r>
         <w:rPr>
@@ -195,98 +211,7 @@
           <w:b/>
           <w:bCs/>
         </w:rPr>
-        <w:t xml:space="preserve">Tipo de ataque:</w:t>
-      </w:r>
-      <w:r>
-        <w:rPr>
-          <w:rFonts w:ascii="Calibri" w:cs="Calibri" w:eastAsia="Calibri" w:hAnsi="Calibri"/>
-        </w:rPr>
-        <w:t xml:space="preserve"> ransomware, con ingeniería social (phishing) como vector de entrada.</w:t>
-      </w:r>
-    </w:p>
-    <w:p>
-      <w:pPr>
-        <w:pStyle w:val="ListParagraph"/>
-        <w:numPr>
-          <w:ilvl w:val="0"/>
-          <w:numId w:val="2"/>
-        </w:numPr>
-        <w:spacing w:after="60"/>
-      </w:pPr>
-      <w:r>
-        <w:rPr>
-          <w:rFonts w:ascii="Calibri" w:cs="Calibri" w:eastAsia="Calibri" w:hAnsi="Calibri"/>
-          <w:b/>
-          <w:bCs/>
-        </w:rPr>
-        <w:t xml:space="preserve">Amenaza:</w:t>
-      </w:r>
-      <w:r>
-        <w:rPr>
-          <w:rFonts w:ascii="Calibri" w:cs="Calibri" w:eastAsia="Calibri" w:hAnsi="Calibri"/>
-        </w:rPr>
-        <w:t xml:space="preserve"> actor externo con motivación económica.</w:t>
-      </w:r>
-    </w:p>
-    <w:p>
-      <w:pPr>
-        <w:pStyle w:val="ListParagraph"/>
-        <w:numPr>
-          <w:ilvl w:val="0"/>
-          <w:numId w:val="2"/>
-        </w:numPr>
-        <w:spacing w:after="60"/>
-      </w:pPr>
-      <w:r>
-        <w:rPr>
-          <w:rFonts w:ascii="Calibri" w:cs="Calibri" w:eastAsia="Calibri" w:hAnsi="Calibri"/>
-          <w:b/>
-          <w:bCs/>
-        </w:rPr>
-        <w:t xml:space="preserve">Vulnerabilidades explotadas:</w:t>
-      </w:r>
-      <w:r>
-        <w:rPr>
-          <w:rFonts w:ascii="Calibri" w:cs="Calibri" w:eastAsia="Calibri" w:hAnsi="Calibri"/>
-        </w:rPr>
-        <w:t xml:space="preserve"> factor humano (abrir el archivo sin verificar), antivirus desactualizado, falta de segmentación de red y falta de capacitación.</w:t>
-      </w:r>
-    </w:p>
-    <w:p>
-      <w:pPr>
-        <w:pStyle w:val="ListParagraph"/>
-        <w:numPr>
-          <w:ilvl w:val="0"/>
-          <w:numId w:val="2"/>
-        </w:numPr>
-        <w:spacing w:after="60"/>
-      </w:pPr>
-      <w:r>
-        <w:rPr>
-          <w:rFonts w:ascii="Calibri" w:cs="Calibri" w:eastAsia="Calibri" w:hAnsi="Calibri"/>
-          <w:b/>
-          <w:bCs/>
-        </w:rPr>
-        <w:t xml:space="preserve">Activos afectados:</w:t>
-      </w:r>
-      <w:r>
-        <w:rPr>
-          <w:rFonts w:ascii="Calibri" w:cs="Calibri" w:eastAsia="Calibri" w:hAnsi="Calibri"/>
-        </w:rPr>
-        <w:t xml:space="preserve"> servidor principal, bases de datos de clientes, ERP/CRM y la continuidad de las operaciones.</w:t>
-      </w:r>
-    </w:p>
-    <w:p>
-      <w:pPr>
-        <w:spacing w:after="80" w:before="160"/>
-      </w:pPr>
-      <w:r>
-        <w:rPr>
-          <w:rFonts w:ascii="Calibri" w:cs="Calibri" w:eastAsia="Calibri" w:hAnsi="Calibri"/>
-          <w:b/>
-          <w:bCs/>
-        </w:rPr>
-        <w:t xml:space="preserve">Tríada de la CIA: qué se afectó</w:t>
+        <w:t xml:space="preserve">Tríada de la CIA</w:t>
       </w:r>
     </w:p>
     <w:tbl>
@@ -419,7 +344,7 @@
               <w:rPr>
                 <w:rFonts w:ascii="Calibri" w:cs="Calibri" w:eastAsia="Calibri" w:hAnsi="Calibri"/>
               </w:rPr>
-              <w:t xml:space="preserve">Es el más afectado: archivos cifrados, bases de datos inaccesibles y 5 días sin operar</w:t>
+              <w:t xml:space="preserve">Es el más afectado: los archivos quedaron cifrados, las bases de datos inaccesibles y la empresa estuvo cinco días sin operar</w:t>
             </w:r>
           </w:p>
         </w:tc>
@@ -475,7 +400,7 @@
               <w:rPr>
                 <w:rFonts w:ascii="Calibri" w:cs="Calibri" w:eastAsia="Calibri" w:hAnsi="Calibri"/>
               </w:rPr>
-              <w:t xml:space="preserve">Los archivos cifrados dejaron de ser utilizables, y no se puede confiar en que los datos no se hayan alterado hasta verificarlos</w:t>
+              <w:t xml:space="preserve">Los archivos cifrados dejaron de ser utilizables, y mientras no se verifiquen no podemos asegurar que los datos no hayan sido alterados</w:t>
             </w:r>
           </w:p>
         </w:tc>
@@ -531,7 +456,7 @@
               <w:rPr>
                 <w:rFonts w:ascii="Calibri" w:cs="Calibri" w:eastAsia="Calibri" w:hAnsi="Calibri"/>
               </w:rPr>
-              <w:t xml:space="preserve">En riesgo, porque el malware se conectó a un servidor remoto. El caso no confirma robo de datos, así que hay que investigarlo (los ransomware modernos a veces exfiltran antes de cifrar)</w:t>
+              <w:t xml:space="preserve">Está en riesgo porque el malware se conectó a un servidor remoto. El caso no confirma robo de datos, así que habría que investigarlo, ya que algunos ransomware roban la información antes de cifrarla</w:t>
             </w:r>
           </w:p>
         </w:tc>
@@ -743,7 +668,7 @@
               <w:rPr>
                 <w:rFonts w:ascii="Calibri" w:cs="Calibri" w:eastAsia="Calibri" w:hAnsi="Calibri"/>
               </w:rPr>
-              <w:t xml:space="preserve">El atacante identificó a un proveedor habitual y al departamento de contabilidad como objetivo (se deduce del tipo de correo; el caso no lo dice)</w:t>
+              <w:t xml:space="preserve">Suponemos que el atacante investigó a la empresa y eligió a contabilidad y a un proveedor habitual como objetivo, porque el correo era muy creíble. El caso no lo menciona de forma explícita</w:t>
             </w:r>
           </w:p>
         </w:tc>
@@ -827,7 +752,7 @@
               <w:rPr>
                 <w:rFonts w:ascii="Calibri" w:cs="Calibri" w:eastAsia="Calibri" w:hAnsi="Calibri"/>
               </w:rPr>
-              <w:t xml:space="preserve">Preparó un PDF con un script malicioso (macros) que descarga o ejecuta el ransomware</w:t>
+              <w:t xml:space="preserve">Preparó un PDF con un script malicioso que ejecuta el ransomware</w:t>
             </w:r>
           </w:p>
         </w:tc>
@@ -911,7 +836,7 @@
               <w:rPr>
                 <w:rFonts w:ascii="Calibri" w:cs="Calibri" w:eastAsia="Calibri" w:hAnsi="Calibri"/>
               </w:rPr>
-              <w:t xml:space="preserve">Correo de phishing que aparentaba ser de un proveedor conocido</w:t>
+              <w:t xml:space="preserve">Envió un correo de phishing que aparentaba ser de un proveedor conocido</w:t>
             </w:r>
           </w:p>
         </w:tc>
@@ -1079,7 +1004,7 @@
               <w:rPr>
                 <w:rFonts w:ascii="Calibri" w:cs="Calibri" w:eastAsia="Calibri" w:hAnsi="Calibri"/>
               </w:rPr>
-              <w:t xml:space="preserve">El malware se instaló en el equipo y se propagó. La falta de segmentación de red facilitó que llegara al servidor principal</w:t>
+              <w:t xml:space="preserve">El malware se instaló y se propagó. La falta de segmentación de red le permitió llegar al servidor principal</w:t>
             </w:r>
           </w:p>
         </w:tc>
@@ -1163,7 +1088,7 @@
               <w:rPr>
                 <w:rFonts w:ascii="Calibri" w:cs="Calibri" w:eastAsia="Calibri" w:hAnsi="Calibri"/>
               </w:rPr>
-              <w:t xml:space="preserve">Conexión con un servidor remoto del atacante</w:t>
+              <w:t xml:space="preserve">Se conectó con un servidor remoto del atacante</w:t>
             </w:r>
           </w:p>
         </w:tc>
@@ -1247,7 +1172,7 @@
               <w:rPr>
                 <w:rFonts w:ascii="Calibri" w:cs="Calibri" w:eastAsia="Calibri" w:hAnsi="Calibri"/>
               </w:rPr>
-              <w:t xml:space="preserve">Cifrado del 80 % de los archivos y exigencia del rescate</w:t>
+              <w:t xml:space="preserve">Cifró el 80 % de los archivos y exigió el rescate</w:t>
             </w:r>
           </w:p>
         </w:tc>
@@ -1260,26 +1185,27 @@
     </w:p>
     <w:p>
       <w:pPr>
-        <w:pStyle w:val="ListParagraph"/>
-        <w:numPr>
-          <w:ilvl w:val="0"/>
-          <w:numId w:val="2"/>
-        </w:numPr>
-        <w:spacing w:after="60"/>
-      </w:pPr>
+        <w:spacing w:after="100"/>
+      </w:pPr>
+      <w:r>
+        <w:rPr>
+          <w:rFonts w:ascii="Calibri" w:cs="Calibri" w:eastAsia="Calibri" w:hAnsi="Calibri"/>
+        </w:rPr>
+        <w:t xml:space="preserve">La cadena se pudo cortar en tres puntos: en la </w:t>
+      </w:r>
       <w:r>
         <w:rPr>
           <w:rFonts w:ascii="Calibri" w:cs="Calibri" w:eastAsia="Calibri" w:hAnsi="Calibri"/>
           <w:b/>
           <w:bCs/>
         </w:rPr>
-        <w:t xml:space="preserve">Dónde se pudo cortar la cadena:</w:t>
-      </w:r>
-      <w:r>
-        <w:rPr>
-          <w:rFonts w:ascii="Calibri" w:cs="Calibri" w:eastAsia="Calibri" w:hAnsi="Calibri"/>
-        </w:rPr>
-        <w:t xml:space="preserve"> en la </w:t>
+        <w:t xml:space="preserve">entrega</w:t>
+      </w:r>
+      <w:r>
+        <w:rPr>
+          <w:rFonts w:ascii="Calibri" w:cs="Calibri" w:eastAsia="Calibri" w:hAnsi="Calibri"/>
+        </w:rPr>
+        <w:t xml:space="preserve">, con un filtro de correo y de adjuntos; en la </w:t>
       </w:r>
       <w:r>
         <w:rPr>
@@ -1287,13 +1213,13 @@
           <w:b/>
           <w:bCs/>
         </w:rPr>
-        <w:t xml:space="preserve">entrega</w:t>
-      </w:r>
-      <w:r>
-        <w:rPr>
-          <w:rFonts w:ascii="Calibri" w:cs="Calibri" w:eastAsia="Calibri" w:hAnsi="Calibri"/>
-        </w:rPr>
-        <w:t xml:space="preserve"> (filtro de correo y adjuntos), en la </w:t>
+        <w:t xml:space="preserve">explotación</w:t>
+      </w:r>
+      <w:r>
+        <w:rPr>
+          <w:rFonts w:ascii="Calibri" w:cs="Calibri" w:eastAsia="Calibri" w:hAnsi="Calibri"/>
+        </w:rPr>
+        <w:t xml:space="preserve">, con usuarios capacitados, macros desactivadas y antivirus actualizado; y en la </w:t>
       </w:r>
       <w:r>
         <w:rPr>
@@ -1301,56 +1227,24 @@
           <w:b/>
           <w:bCs/>
         </w:rPr>
-        <w:t xml:space="preserve">explotación</w:t>
-      </w:r>
-      <w:r>
-        <w:rPr>
-          <w:rFonts w:ascii="Calibri" w:cs="Calibri" w:eastAsia="Calibri" w:hAnsi="Calibri"/>
-        </w:rPr>
-        <w:t xml:space="preserve"> (usuario capacitado, macros desactivadas, antivirus actualizado) y en la </w:t>
-      </w:r>
-      <w:r>
-        <w:rPr>
-          <w:rFonts w:ascii="Calibri" w:cs="Calibri" w:eastAsia="Calibri" w:hAnsi="Calibri"/>
-          <w:b/>
-          <w:bCs/>
-        </w:rPr>
         <w:t xml:space="preserve">instalación</w:t>
       </w:r>
       <w:r>
         <w:rPr>
           <w:rFonts w:ascii="Calibri" w:cs="Calibri" w:eastAsia="Calibri" w:hAnsi="Calibri"/>
         </w:rPr>
-        <w:t xml:space="preserve"> (segmentación de red). Mientras más temprano se corte, menor el daño.</w:t>
+        <w:t xml:space="preserve">, con segmentación de red. Mientras más temprano se corte, menor es el daño.</w:t>
       </w:r>
     </w:p>
     <w:p>
       <w:pPr>
-        <w:spacing w:after="80" w:before="160"/>
-      </w:pPr>
-      <w:r>
-        <w:rPr>
-          <w:rFonts w:ascii="Calibri" w:cs="Calibri" w:eastAsia="Calibri" w:hAnsi="Calibri"/>
-          <w:b/>
-          <w:bCs/>
-        </w:rPr>
-        <w:t xml:space="preserve">MITRE ATT&amp;CK (referencia)</w:t>
-      </w:r>
-    </w:p>
-    <w:p>
-      <w:pPr>
-        <w:pStyle w:val="ListParagraph"/>
-        <w:numPr>
-          <w:ilvl w:val="0"/>
-          <w:numId w:val="2"/>
-        </w:numPr>
-        <w:spacing w:after="60"/>
-      </w:pPr>
-      <w:r>
-        <w:rPr>
-          <w:rFonts w:ascii="Calibri" w:cs="Calibri" w:eastAsia="Calibri" w:hAnsi="Calibri"/>
-        </w:rPr>
-        <w:t xml:space="preserve">Phishing (T1566), ejecución por el usuario (T1204) y datos cifrados para causar impacto (T1486).</w:t>
+        <w:spacing w:after="100"/>
+      </w:pPr>
+      <w:r>
+        <w:rPr>
+          <w:rFonts w:ascii="Calibri" w:cs="Calibri" w:eastAsia="Calibri" w:hAnsi="Calibri"/>
+        </w:rPr>
+        <w:t xml:space="preserve">Según el marco MITRE ATT&amp;CK, el ataque corresponde a las técnicas de phishing (T1566), ejecución por el usuario (T1204) y datos cifrados para causar impacto (T1486).</w:t>
       </w:r>
     </w:p>
     <w:p>
@@ -1496,7 +1390,7 @@
               <w:rPr>
                 <w:rFonts w:ascii="Calibri" w:cs="Calibri" w:eastAsia="Calibri" w:hAnsi="Calibri"/>
               </w:rPr>
-              <w:t xml:space="preserve">Empleado abrió el archivo sin verificar al remitente. No tenía formación en seguridad digital</w:t>
+              <w:t xml:space="preserve">El empleado abrió el archivo sin verificar al remitente y no tenía formación en seguridad digital</w:t>
             </w:r>
           </w:p>
         </w:tc>
@@ -1552,7 +1446,7 @@
               <w:rPr>
                 <w:rFonts w:ascii="Calibri" w:cs="Calibri" w:eastAsia="Calibri" w:hAnsi="Calibri"/>
               </w:rPr>
-              <w:t xml:space="preserve">Antivirus sin actualizar, falta de segmentación de red, falta de copias de seguridad seguras, contraseñas débiles y sin autenticación multifactor</w:t>
+              <w:t xml:space="preserve">Antivirus sin actualizar, red sin segmentar, copias de seguridad poco seguras, contraseñas débiles y ausencia de autenticación multifactor</w:t>
             </w:r>
           </w:p>
         </w:tc>
@@ -1582,7 +1476,7 @@
                 <w:b/>
                 <w:bCs/>
               </w:rPr>
-              <w:t xml:space="preserve">Organizacional / de gobernanza</w:t>
+              <w:t xml:space="preserve">Organizacional</w:t>
             </w:r>
           </w:p>
         </w:tc>
@@ -1608,7 +1502,7 @@
               <w:rPr>
                 <w:rFonts w:ascii="Calibri" w:cs="Calibri" w:eastAsia="Calibri" w:hAnsi="Calibri"/>
               </w:rPr>
-              <w:t xml:space="preserve">Crecimiento acelerado sin auditorías regulares, sin capacitación, sin plan de respuesta a incidentes y sin políticas de seguridad claras</w:t>
+              <w:t xml:space="preserve">Crecimiento acelerado sin auditorías, sin capacitación, sin plan de respuesta a incidentes y sin políticas de seguridad claras</w:t>
             </w:r>
           </w:p>
         </w:tc>
@@ -1621,6 +1515,17 @@
     </w:p>
     <w:p>
       <w:pPr>
+        <w:spacing w:after="100"/>
+      </w:pPr>
+      <w:r>
+        <w:rPr>
+          <w:rFonts w:ascii="Calibri" w:cs="Calibri" w:eastAsia="Calibri" w:hAnsi="Calibri"/>
+        </w:rPr>
+        <w:t xml:space="preserve">Concluimos que el ataque no fue únicamente un fallo técnico: combinó un error humano con la falta de controles básicos y de gobernanza.</w:t>
+      </w:r>
+    </w:p>
+    <w:p>
+      <w:pPr>
         <w:spacing w:after="120" w:before="280"/>
       </w:pPr>
       <w:r>
@@ -1653,7 +1558,7 @@
         <w:rPr>
           <w:rFonts w:ascii="Calibri" w:cs="Calibri" w:eastAsia="Calibri" w:hAnsi="Calibri"/>
         </w:rPr>
-        <w:t xml:space="preserve">Nivel de riesgo = probabilidad × impacto. Los valores de las primeras columnas vienen del caso. La última columna es una </w:t>
+        <w:t xml:space="preserve">El nivel de riesgo se obtiene combinando la probabilidad con el impacto. Los valores iniciales son los del caso. Para la última columna hacemos una </w:t>
       </w:r>
       <w:r>
         <w:rPr>
@@ -1667,7 +1572,7 @@
         <w:rPr>
           <w:rFonts w:ascii="Calibri" w:cs="Calibri" w:eastAsia="Calibri" w:hAnsi="Calibri"/>
         </w:rPr>
-        <w:t xml:space="preserve"> de cómo quedan los riesgos después de las medidas implementadas.</w:t>
+        <w:t xml:space="preserve"> del nivel residual, es decir, el riesgo que queda después de aplicar las medidas correctivas, considerando cuánto cubre cada una de ellas.</w:t>
       </w:r>
     </w:p>
     <w:tbl>
@@ -1864,7 +1769,7 @@
                 <w:bCs/>
                 <w:color w:val="000000"/>
               </w:rPr>
-              <w:t xml:space="preserve">Por qué</w:t>
+              <w:t xml:space="preserve">Justificación</w:t>
             </w:r>
           </w:p>
         </w:tc>
@@ -2024,7 +1929,7 @@
               <w:rPr>
                 <w:rFonts w:ascii="Calibri" w:cs="Calibri" w:eastAsia="Calibri" w:hAnsi="Calibri"/>
               </w:rPr>
-              <w:t xml:space="preserve">Capacitación y EDR ayudan, pero falta filtro de correo</w:t>
+              <w:t xml:space="preserve">La capacitación y el EDR ayudan, pero falta un filtro de correo</w:t>
             </w:r>
           </w:p>
         </w:tc>
@@ -2184,7 +2089,7 @@
               <w:rPr>
                 <w:rFonts w:ascii="Calibri" w:cs="Calibri" w:eastAsia="Calibri" w:hAnsi="Calibri"/>
               </w:rPr>
-              <w:t xml:space="preserve">Capacitación obligatoria, pero hay que repetirla</w:t>
+              <w:t xml:space="preserve">La capacitación es obligatoria, pero debe repetirse</w:t>
             </w:r>
           </w:p>
         </w:tc>
@@ -2344,7 +2249,7 @@
               <w:rPr>
                 <w:rFonts w:ascii="Calibri" w:cs="Calibri" w:eastAsia="Calibri" w:hAnsi="Calibri"/>
               </w:rPr>
-              <w:t xml:space="preserve">Solo hay copias parciales</w:t>
+              <w:t xml:space="preserve">Solo existen copias parciales</w:t>
             </w:r>
           </w:p>
         </w:tc>
@@ -2504,7 +2409,7 @@
               <w:rPr>
                 <w:rFonts w:ascii="Calibri" w:cs="Calibri" w:eastAsia="Calibri" w:hAnsi="Calibri"/>
               </w:rPr>
-              <w:t xml:space="preserve">MFA, pero falta política de contraseñas</w:t>
+              <w:t xml:space="preserve">El MFA ayuda, pero falta una política de contraseñas</w:t>
             </w:r>
           </w:p>
         </w:tc>
@@ -2674,6 +2579,97 @@
       <w:pPr>
         <w:spacing w:after="80"/>
       </w:pPr>
+    </w:p>
+    <w:p>
+      <w:pPr>
+        <w:spacing w:after="100"/>
+      </w:pPr>
+      <w:r>
+        <w:rPr>
+          <w:rFonts w:ascii="Calibri" w:cs="Calibri" w:eastAsia="Calibri" w:hAnsi="Calibri"/>
+        </w:rPr>
+        <w:t xml:space="preserve">Los dos riesgos críticos, phishing y acceso no autorizado, deben atenderse primero, y después los de nivel alto.</w:t>
+      </w:r>
+    </w:p>
+    <w:p>
+      <w:pPr>
+        <w:spacing w:after="80" w:before="160"/>
+      </w:pPr>
+      <w:r>
+        <w:rPr>
+          <w:rFonts w:ascii="Calibri" w:cs="Calibri" w:eastAsia="Calibri" w:hAnsi="Calibri"/>
+          <w:b/>
+          <w:bCs/>
+        </w:rPr>
+        <w:t xml:space="preserve">Análisis cuantitativo</w:t>
+      </w:r>
+    </w:p>
+    <w:p>
+      <w:pPr>
+        <w:spacing w:after="100"/>
+      </w:pPr>
+      <w:r>
+        <w:rPr>
+          <w:rFonts w:ascii="Calibri" w:cs="Calibri" w:eastAsia="Calibri" w:hAnsi="Calibri"/>
+        </w:rPr>
+        <w:t xml:space="preserve">Del caso tomamos la </w:t>
+      </w:r>
+      <w:r>
+        <w:rPr>
+          <w:rFonts w:ascii="Calibri" w:cs="Calibri" w:eastAsia="Calibri" w:hAnsi="Calibri"/>
+          <w:b/>
+          <w:bCs/>
+        </w:rPr>
+        <w:t xml:space="preserve">expectativa de pérdida única (SLE)</w:t>
+      </w:r>
+      <w:r>
+        <w:rPr>
+          <w:rFonts w:ascii="Calibri" w:cs="Calibri" w:eastAsia="Calibri" w:hAnsi="Calibri"/>
+        </w:rPr>
+        <w:t xml:space="preserve">, que es de </w:t>
+      </w:r>
+      <w:r>
+        <w:rPr>
+          <w:rFonts w:ascii="Calibri" w:cs="Calibri" w:eastAsia="Calibri" w:hAnsi="Calibri"/>
+          <w:b/>
+          <w:bCs/>
+        </w:rPr>
+        <w:t xml:space="preserve">75 000 USD</w:t>
+      </w:r>
+      <w:r>
+        <w:rPr>
+          <w:rFonts w:ascii="Calibri" w:cs="Calibri" w:eastAsia="Calibri" w:hAnsi="Calibri"/>
+        </w:rPr>
+        <w:t xml:space="preserve">. Como el caso no da la frecuencia del ataque, </w:t>
+      </w:r>
+      <w:r>
+        <w:rPr>
+          <w:rFonts w:ascii="Calibri" w:cs="Calibri" w:eastAsia="Calibri" w:hAnsi="Calibri"/>
+          <w:b/>
+          <w:bCs/>
+        </w:rPr>
+        <w:t xml:space="preserve">supongamos que ocurre una vez cada dos años</w:t>
+      </w:r>
+      <w:r>
+        <w:rPr>
+          <w:rFonts w:ascii="Calibri" w:cs="Calibri" w:eastAsia="Calibri" w:hAnsi="Calibri"/>
+        </w:rPr>
+        <w:t xml:space="preserve">, es decir, que la </w:t>
+      </w:r>
+      <w:r>
+        <w:rPr>
+          <w:rFonts w:ascii="Calibri" w:cs="Calibri" w:eastAsia="Calibri" w:hAnsi="Calibri"/>
+          <w:b/>
+          <w:bCs/>
+        </w:rPr>
+        <w:t xml:space="preserve">tasa de ocurrencia anual (ARO) es de 0,5</w:t>
+      </w:r>
+      <w:r>
+        <w:rPr>
+          <w:rFonts w:ascii="Calibri" w:cs="Calibri" w:eastAsia="Calibri" w:hAnsi="Calibri"/>
+        </w:rPr>
+        <w:t xml:space="preserve">. Con ese supuesto:</w:t>
+      </w:r>
     </w:p>
     <w:p>
       <w:pPr>
@@ -2690,13 +2686,13 @@
           <w:b/>
           <w:bCs/>
         </w:rPr>
-        <w:t xml:space="preserve">Prioridad de atención:</w:t>
-      </w:r>
-      <w:r>
-        <w:rPr>
-          <w:rFonts w:ascii="Calibri" w:cs="Calibri" w:eastAsia="Calibri" w:hAnsi="Calibri"/>
-        </w:rPr>
-        <w:t xml:space="preserve"> primero los dos riesgos </w:t>
+        <w:t xml:space="preserve">ALE</w:t>
+      </w:r>
+      <w:r>
+        <w:rPr>
+          <w:rFonts w:ascii="Calibri" w:cs="Calibri" w:eastAsia="Calibri" w:hAnsi="Calibri"/>
+        </w:rPr>
+        <w:t xml:space="preserve"> (expectativa de pérdida anual) = SLE × ARO = 75 000 × 0,5 = </w:t>
       </w:r>
       <w:r>
         <w:rPr>
@@ -2704,214 +2700,35 @@
           <w:b/>
           <w:bCs/>
         </w:rPr>
-        <w:t xml:space="preserve">críticos</w:t>
-      </w:r>
-      <w:r>
-        <w:rPr>
-          <w:rFonts w:ascii="Calibri" w:cs="Calibri" w:eastAsia="Calibri" w:hAnsi="Calibri"/>
-        </w:rPr>
-        <w:t xml:space="preserve"> (phishing y acceso no autorizado), luego los de nivel alto.</w:t>
+        <w:t xml:space="preserve">37 500 USD al año</w:t>
+      </w:r>
+      <w:r>
+        <w:rPr>
+          <w:rFonts w:ascii="Calibri" w:cs="Calibri" w:eastAsia="Calibri" w:hAnsi="Calibri"/>
+        </w:rPr>
+        <w:t xml:space="preserve">.</w:t>
       </w:r>
     </w:p>
     <w:p>
       <w:pPr>
-        <w:spacing w:after="80" w:before="160"/>
-      </w:pPr>
-      <w:r>
-        <w:rPr>
-          <w:rFonts w:ascii="Calibri" w:cs="Calibri" w:eastAsia="Calibri" w:hAnsi="Calibri"/>
-          <w:b/>
-          <w:bCs/>
-        </w:rPr>
-        <w:t xml:space="preserve">Análisis cuantitativo (ejemplo con supuestos)</w:t>
+        <w:spacing w:after="100"/>
+      </w:pPr>
+      <w:r>
+        <w:rPr>
+          <w:rFonts w:ascii="Calibri" w:cs="Calibri" w:eastAsia="Calibri" w:hAnsi="Calibri"/>
+        </w:rPr>
+        <w:t xml:space="preserve">Si los controles (MFA, EDR, capacitación y copias de seguridad) cuestan menos de esa cifra al año y reducen de forma importante la probabilidad del ataque, la inversión se justifica.</w:t>
       </w:r>
     </w:p>
     <w:p>
       <w:pPr>
-        <w:pStyle w:val="ListParagraph"/>
-        <w:numPr>
-          <w:ilvl w:val="0"/>
-          <w:numId w:val="2"/>
-        </w:numPr>
-        <w:spacing w:after="60"/>
-      </w:pPr>
-      <w:r>
-        <w:rPr>
-          <w:rFonts w:ascii="Calibri" w:cs="Calibri" w:eastAsia="Calibri" w:hAnsi="Calibri"/>
-          <w:b/>
-          <w:bCs/>
-        </w:rPr>
-        <w:t xml:space="preserve">SLE</w:t>
-      </w:r>
-      <w:r>
-        <w:rPr>
-          <w:rFonts w:ascii="Calibri" w:cs="Calibri" w:eastAsia="Calibri" w:hAnsi="Calibri"/>
-        </w:rPr>
-        <w:t xml:space="preserve"> (expectativa de pérdida única) = </w:t>
-      </w:r>
-      <w:r>
-        <w:rPr>
-          <w:rFonts w:ascii="Calibri" w:cs="Calibri" w:eastAsia="Calibri" w:hAnsi="Calibri"/>
-          <w:b/>
-          <w:bCs/>
-        </w:rPr>
-        <w:t xml:space="preserve">75 000 USD</w:t>
-      </w:r>
-      <w:r>
-        <w:rPr>
-          <w:rFonts w:ascii="Calibri" w:cs="Calibri" w:eastAsia="Calibri" w:hAnsi="Calibri"/>
-        </w:rPr>
-        <w:t xml:space="preserve">, según el caso.</w:t>
-      </w:r>
-    </w:p>
-    <w:p>
-      <w:pPr>
-        <w:pStyle w:val="ListParagraph"/>
-        <w:numPr>
-          <w:ilvl w:val="0"/>
-          <w:numId w:val="2"/>
-        </w:numPr>
-        <w:spacing w:after="60"/>
-      </w:pPr>
-      <w:r>
-        <w:rPr>
-          <w:rFonts w:ascii="Calibri" w:cs="Calibri" w:eastAsia="Calibri" w:hAnsi="Calibri"/>
-        </w:rPr>
-        <w:t xml:space="preserve">Supuesto: un ataque así podría repetirse </w:t>
-      </w:r>
-      <w:r>
-        <w:rPr>
-          <w:rFonts w:ascii="Calibri" w:cs="Calibri" w:eastAsia="Calibri" w:hAnsi="Calibri"/>
-          <w:b/>
-          <w:bCs/>
-        </w:rPr>
-        <w:t xml:space="preserve">una vez cada 2 años</w:t>
-      </w:r>
-      <w:r>
-        <w:rPr>
-          <w:rFonts w:ascii="Calibri" w:cs="Calibri" w:eastAsia="Calibri" w:hAnsi="Calibri"/>
-        </w:rPr>
-        <w:t xml:space="preserve">, o sea una </w:t>
-      </w:r>
-      <w:r>
-        <w:rPr>
-          <w:rFonts w:ascii="Calibri" w:cs="Calibri" w:eastAsia="Calibri" w:hAnsi="Calibri"/>
-          <w:b/>
-          <w:bCs/>
-        </w:rPr>
-        <w:t xml:space="preserve">tasa de ocurrencia anual (ARO) = 0,5</w:t>
-      </w:r>
-      <w:r>
-        <w:rPr>
-          <w:rFonts w:ascii="Calibri" w:cs="Calibri" w:eastAsia="Calibri" w:hAnsi="Calibri"/>
-        </w:rPr>
-        <w:t xml:space="preserve">. Es un supuesto mío, el caso no lo da.</w:t>
-      </w:r>
-    </w:p>
-    <w:p>
-      <w:pPr>
-        <w:pStyle w:val="ListParagraph"/>
-        <w:numPr>
-          <w:ilvl w:val="0"/>
-          <w:numId w:val="2"/>
-        </w:numPr>
-        <w:spacing w:after="60"/>
-      </w:pPr>
-      <w:r>
-        <w:rPr>
-          <w:rFonts w:ascii="Calibri" w:cs="Calibri" w:eastAsia="Calibri" w:hAnsi="Calibri"/>
-          <w:b/>
-          <w:bCs/>
-        </w:rPr>
-        <w:t xml:space="preserve">ALE</w:t>
-      </w:r>
-      <w:r>
-        <w:rPr>
-          <w:rFonts w:ascii="Calibri" w:cs="Calibri" w:eastAsia="Calibri" w:hAnsi="Calibri"/>
-        </w:rPr>
-        <w:t xml:space="preserve"> (expectativa de pérdida anual) = SLE × ARO = 75 000 × 0,5 = </w:t>
-      </w:r>
-      <w:r>
-        <w:rPr>
-          <w:rFonts w:ascii="Calibri" w:cs="Calibri" w:eastAsia="Calibri" w:hAnsi="Calibri"/>
-          <w:b/>
-          <w:bCs/>
-        </w:rPr>
-        <w:t xml:space="preserve">37 500 USD al año</w:t>
-      </w:r>
-      <w:r>
-        <w:rPr>
-          <w:rFonts w:ascii="Calibri" w:cs="Calibri" w:eastAsia="Calibri" w:hAnsi="Calibri"/>
-        </w:rPr>
-        <w:t xml:space="preserve">.</w:t>
-      </w:r>
-    </w:p>
-    <w:p>
-      <w:pPr>
-        <w:pStyle w:val="ListParagraph"/>
-        <w:numPr>
-          <w:ilvl w:val="0"/>
-          <w:numId w:val="2"/>
-        </w:numPr>
-        <w:spacing w:after="60"/>
-      </w:pPr>
-      <w:r>
-        <w:rPr>
-          <w:rFonts w:ascii="Calibri" w:cs="Calibri" w:eastAsia="Calibri" w:hAnsi="Calibri"/>
-        </w:rPr>
-        <w:t xml:space="preserve">Si los controles (MFA, EDR, capacitación, copias de seguridad) cuestan </w:t>
-      </w:r>
-      <w:r>
-        <w:rPr>
-          <w:rFonts w:ascii="Calibri" w:cs="Calibri" w:eastAsia="Calibri" w:hAnsi="Calibri"/>
-          <w:b/>
-          <w:bCs/>
-        </w:rPr>
-        <w:t xml:space="preserve">menos de 37 500 USD al año</w:t>
-      </w:r>
-      <w:r>
-        <w:rPr>
-          <w:rFonts w:ascii="Calibri" w:cs="Calibri" w:eastAsia="Calibri" w:hAnsi="Calibri"/>
-        </w:rPr>
-        <w:t xml:space="preserve"> y reducen mucho la probabilidad, </w:t>
-      </w:r>
-      <w:r>
-        <w:rPr>
-          <w:rFonts w:ascii="Calibri" w:cs="Calibri" w:eastAsia="Calibri" w:hAnsi="Calibri"/>
-          <w:b/>
-          <w:bCs/>
-        </w:rPr>
-        <w:t xml:space="preserve">la inversión se justifica</w:t>
-      </w:r>
-      <w:r>
-        <w:rPr>
-          <w:rFonts w:ascii="Calibri" w:cs="Calibri" w:eastAsia="Calibri" w:hAnsi="Calibri"/>
-        </w:rPr>
-        <w:t xml:space="preserve">.</w:t>
-      </w:r>
-    </w:p>
-    <w:p>
-      <w:pPr>
-        <w:pStyle w:val="ListParagraph"/>
-        <w:numPr>
-          <w:ilvl w:val="0"/>
-          <w:numId w:val="2"/>
-        </w:numPr>
-        <w:spacing w:after="60"/>
-      </w:pPr>
-      <w:r>
-        <w:rPr>
-          <w:rFonts w:ascii="Calibri" w:cs="Calibri" w:eastAsia="Calibri" w:hAnsi="Calibri"/>
-          <w:b/>
-          <w:bCs/>
-        </w:rPr>
-        <w:t xml:space="preserve">Pagar el rescate (15 000 USD) no es buena opción:</w:t>
-      </w:r>
-      <w:r>
-        <w:rPr>
-          <w:rFonts w:ascii="Calibri" w:cs="Calibri" w:eastAsia="Calibri" w:hAnsi="Calibri"/>
-        </w:rPr>
-        <w:t xml:space="preserve"> no garantiza recuperar los datos, financia al atacante y no corrige la causa. La pérdida total (75 000 USD) incluye costos que el pago no evita, como los días sin operar.</w:t>
+        <w:spacing w:after="100"/>
+      </w:pPr>
+      <w:r>
+        <w:rPr>
+          <w:rFonts w:ascii="Calibri" w:cs="Calibri" w:eastAsia="Calibri" w:hAnsi="Calibri"/>
+        </w:rPr>
+        <w:t xml:space="preserve">Pagar el rescate de 15 000 USD tampoco es una buena opción. No garantiza recuperar los datos, financia al atacante y no corrige la causa del problema. Además, la pérdida total incluye costos que el pago no evita, como los cinco días sin operar.</w:t>
       </w:r>
     </w:p>
     <w:p>
@@ -3001,7 +2818,7 @@
                 <w:bCs/>
                 <w:color w:val="000000"/>
               </w:rPr>
-              <w:t xml:space="preserve">Cómo aplica a TechNova</w:t>
+              <w:t xml:space="preserve">Aplicación en TechNova</w:t>
             </w:r>
           </w:p>
         </w:tc>
@@ -3031,7 +2848,7 @@
                 <w:b/>
                 <w:bCs/>
               </w:rPr>
-              <w:t xml:space="preserve">Reducción del riesgo</w:t>
+              <w:t xml:space="preserve">Reducción</w:t>
             </w:r>
           </w:p>
         </w:tc>
@@ -3057,7 +2874,7 @@
               <w:rPr>
                 <w:rFonts w:ascii="Calibri" w:cs="Calibri" w:eastAsia="Calibri" w:hAnsi="Calibri"/>
               </w:rPr>
-              <w:t xml:space="preserve">La principal: MFA, EDR, capacitación, segmentación, parches y backups</w:t>
+              <w:t xml:space="preserve">Es la principal: MFA, EDR, capacitación, segmentación, parches y copias de seguridad</w:t>
             </w:r>
           </w:p>
         </w:tc>
@@ -3087,7 +2904,7 @@
                 <w:b/>
                 <w:bCs/>
               </w:rPr>
-              <w:t xml:space="preserve">Transferencia / riesgo compartido</w:t>
+              <w:t xml:space="preserve">Transferencia</w:t>
             </w:r>
           </w:p>
         </w:tc>
@@ -3113,21 +2930,7 @@
               <w:rPr>
                 <w:rFonts w:ascii="Calibri" w:cs="Calibri" w:eastAsia="Calibri" w:hAnsi="Calibri"/>
               </w:rPr>
-              <w:t xml:space="preserve">Contratar un </w:t>
-            </w:r>
-            <w:r>
-              <w:rPr>
-                <w:rFonts w:ascii="Calibri" w:cs="Calibri" w:eastAsia="Calibri" w:hAnsi="Calibri"/>
-                <w:b/>
-                <w:bCs/>
-              </w:rPr>
-              <w:t xml:space="preserve">seguro de ciberriesgo</w:t>
-            </w:r>
-            <w:r>
-              <w:rPr>
-                <w:rFonts w:ascii="Calibri" w:cs="Calibri" w:eastAsia="Calibri" w:hAnsi="Calibri"/>
-              </w:rPr>
-              <w:t xml:space="preserve"> y usar los acuerdos de nivel de servicio de Azure</w:t>
+              <w:t xml:space="preserve">Contratar un seguro de ciberriesgo y apoyarse en los acuerdos de nivel de servicio de Azure</w:t>
             </w:r>
           </w:p>
         </w:tc>
@@ -3157,7 +2960,7 @@
                 <w:b/>
                 <w:bCs/>
               </w:rPr>
-              <w:t xml:space="preserve">Retención / aceptación</w:t>
+              <w:t xml:space="preserve">Aceptación</w:t>
             </w:r>
           </w:p>
         </w:tc>
@@ -3183,7 +2986,7 @@
               <w:rPr>
                 <w:rFonts w:ascii="Calibri" w:cs="Calibri" w:eastAsia="Calibri" w:hAnsi="Calibri"/>
               </w:rPr>
-              <w:t xml:space="preserve">Aceptar solo el riesgo residual bajo, con revisión periódica</w:t>
+              <w:t xml:space="preserve">Aceptar solo el riesgo residual bajo, con revisiones periódicas</w:t>
             </w:r>
           </w:p>
         </w:tc>
@@ -3239,21 +3042,7 @@
               <w:rPr>
                 <w:rFonts w:ascii="Calibri" w:cs="Calibri" w:eastAsia="Calibri" w:hAnsi="Calibri"/>
               </w:rPr>
-              <w:t xml:space="preserve">Deshabilitar funciones de alto riesgo, como las </w:t>
-            </w:r>
-            <w:r>
-              <w:rPr>
-                <w:rFonts w:ascii="Calibri" w:cs="Calibri" w:eastAsia="Calibri" w:hAnsi="Calibri"/>
-                <w:b/>
-                <w:bCs/>
-              </w:rPr>
-              <w:t xml:space="preserve">macros</w:t>
-            </w:r>
-            <w:r>
-              <w:rPr>
-                <w:rFonts w:ascii="Calibri" w:cs="Calibri" w:eastAsia="Calibri" w:hAnsi="Calibri"/>
-              </w:rPr>
-              <w:t xml:space="preserve"> de documentos que llegan por correo</w:t>
+              <w:t xml:space="preserve">Deshabilitar funciones de alto riesgo, como las macros de los documentos que llegan por correo</w:t>
             </w:r>
           </w:p>
         </w:tc>
@@ -3274,7 +3063,7 @@
           <w:b/>
           <w:bCs/>
         </w:rPr>
-        <w:t xml:space="preserve">5. Evaluación de las medidas correctivas implementadas</w:t>
+        <w:t xml:space="preserve">5. Evaluación de las medidas implementadas</w:t>
       </w:r>
     </w:p>
     <w:tbl>
@@ -3519,7 +3308,7 @@
               <w:rPr>
                 <w:rFonts w:ascii="Calibri" w:cs="Calibri" w:eastAsia="Calibri" w:hAnsi="Calibri"/>
               </w:rPr>
-              <w:t xml:space="preserve">Insuficiente: se necesitan copias completas, fuera de línea y probadas</w:t>
+              <w:t xml:space="preserve">Es insuficiente: se necesitan copias completas, fuera de línea y probadas</w:t>
             </w:r>
           </w:p>
         </w:tc>
@@ -3627,7 +3416,7 @@
               <w:rPr>
                 <w:rFonts w:ascii="Calibri" w:cs="Calibri" w:eastAsia="Calibri" w:hAnsi="Calibri"/>
               </w:rPr>
-              <w:t xml:space="preserve">Buena medida. Complementar con política de contraseñas</w:t>
+              <w:t xml:space="preserve">Es una buena medida, pero falta una política de contraseñas</w:t>
             </w:r>
           </w:p>
         </w:tc>
@@ -3735,7 +3524,7 @@
               <w:rPr>
                 <w:rFonts w:ascii="Calibri" w:cs="Calibri" w:eastAsia="Calibri" w:hAnsi="Calibri"/>
               </w:rPr>
-              <w:t xml:space="preserve">Hay que repetirla de forma periódica</w:t>
+              <w:t xml:space="preserve">Debe repetirse periódicamente</w:t>
             </w:r>
           </w:p>
         </w:tc>
@@ -3765,7 +3554,7 @@
                 <w:b/>
                 <w:bCs/>
               </w:rPr>
-              <w:t xml:space="preserve">Capacitación obligatoria en ciberhigiene</w:t>
+              <w:t xml:space="preserve">Capacitación en ciberhigiene</w:t>
             </w:r>
           </w:p>
         </w:tc>
@@ -3817,7 +3606,7 @@
               <w:rPr>
                 <w:rFonts w:ascii="Calibri" w:cs="Calibri" w:eastAsia="Calibri" w:hAnsi="Calibri"/>
               </w:rPr>
-              <w:t xml:space="preserve">Phishing, falta de capacitación</w:t>
+              <w:t xml:space="preserve">Phishing y falta de capacitación</w:t>
             </w:r>
           </w:p>
         </w:tc>
@@ -3843,7 +3632,7 @@
               <w:rPr>
                 <w:rFonts w:ascii="Calibri" w:cs="Calibri" w:eastAsia="Calibri" w:hAnsi="Calibri"/>
               </w:rPr>
-              <w:t xml:space="preserve">Reforzar con simulacros de phishing</w:t>
+              <w:t xml:space="preserve">Conviene reforzarla con simulacros de phishing</w:t>
             </w:r>
           </w:p>
         </w:tc>
@@ -3951,7 +3740,7 @@
               <w:rPr>
                 <w:rFonts w:ascii="Calibri" w:cs="Calibri" w:eastAsia="Calibri" w:hAnsi="Calibri"/>
               </w:rPr>
-              <w:t xml:space="preserve">Debe monitorearse todo el tiempo</w:t>
+              <w:t xml:space="preserve">Debe monitorearse de forma permanente</w:t>
             </w:r>
           </w:p>
         </w:tc>
@@ -4059,7 +3848,7 @@
               <w:rPr>
                 <w:rFonts w:ascii="Calibri" w:cs="Calibri" w:eastAsia="Calibri" w:hAnsi="Calibri"/>
               </w:rPr>
-              <w:t xml:space="preserve">Hay que practicarlo con ejercicios de mesa</w:t>
+              <w:t xml:space="preserve">Debe practicarse con ejercicios de mesa</w:t>
             </w:r>
           </w:p>
         </w:tc>
@@ -4072,249 +3861,13 @@
     </w:p>
     <w:p>
       <w:pPr>
-        <w:spacing w:after="80" w:before="160"/>
-      </w:pPr>
-      <w:r>
-        <w:rPr>
-          <w:rFonts w:ascii="Calibri" w:cs="Calibri" w:eastAsia="Calibri" w:hAnsi="Calibri"/>
-          <w:b/>
-          <w:bCs/>
-        </w:rPr>
-        <w:t xml:space="preserve">Lo que todavía falta</w:t>
-      </w:r>
-    </w:p>
-    <w:p>
-      <w:pPr>
-        <w:pStyle w:val="ListParagraph"/>
-        <w:numPr>
-          <w:ilvl w:val="0"/>
-          <w:numId w:val="2"/>
-        </w:numPr>
-        <w:spacing w:after="60"/>
-      </w:pPr>
-      <w:r>
-        <w:rPr>
-          <w:rFonts w:ascii="Calibri" w:cs="Calibri" w:eastAsia="Calibri" w:hAnsi="Calibri"/>
-          <w:b/>
-          <w:bCs/>
-        </w:rPr>
-        <w:t xml:space="preserve">Segmentación de red</w:t>
-      </w:r>
-      <w:r>
-        <w:rPr>
-          <w:rFonts w:ascii="Calibri" w:cs="Calibri" w:eastAsia="Calibri" w:hAnsi="Calibri"/>
-        </w:rPr>
-        <w:t xml:space="preserve"> (VLAN, DMZ) para que un equipo infectado no llegue al servidor principal.</w:t>
-      </w:r>
-    </w:p>
-    <w:p>
-      <w:pPr>
-        <w:pStyle w:val="ListParagraph"/>
-        <w:numPr>
-          <w:ilvl w:val="0"/>
-          <w:numId w:val="2"/>
-        </w:numPr>
-        <w:spacing w:after="60"/>
-      </w:pPr>
-      <w:r>
-        <w:rPr>
-          <w:rFonts w:ascii="Calibri" w:cs="Calibri" w:eastAsia="Calibri" w:hAnsi="Calibri"/>
-          <w:b/>
-          <w:bCs/>
-        </w:rPr>
-        <w:t xml:space="preserve">Gestión de parches y antivirus actualizado</w:t>
-      </w:r>
-      <w:r>
-        <w:rPr>
-          <w:rFonts w:ascii="Calibri" w:cs="Calibri" w:eastAsia="Calibri" w:hAnsi="Calibri"/>
-        </w:rPr>
-        <w:t xml:space="preserve"> de forma automática.</w:t>
-      </w:r>
-    </w:p>
-    <w:p>
-      <w:pPr>
-        <w:pStyle w:val="ListParagraph"/>
-        <w:numPr>
-          <w:ilvl w:val="0"/>
-          <w:numId w:val="2"/>
-        </w:numPr>
-        <w:spacing w:after="60"/>
-      </w:pPr>
-      <w:r>
-        <w:rPr>
-          <w:rFonts w:ascii="Calibri" w:cs="Calibri" w:eastAsia="Calibri" w:hAnsi="Calibri"/>
-          <w:b/>
-          <w:bCs/>
-        </w:rPr>
-        <w:t xml:space="preserve">Filtro de correo y web</w:t>
-      </w:r>
-      <w:r>
-        <w:rPr>
-          <w:rFonts w:ascii="Calibri" w:cs="Calibri" w:eastAsia="Calibri" w:hAnsi="Calibri"/>
-        </w:rPr>
-        <w:t xml:space="preserve"> (como Cisco ESA y WSA): bloquear adjuntos peligrosos y analizar enlaces.</w:t>
-      </w:r>
-    </w:p>
-    <w:p>
-      <w:pPr>
-        <w:pStyle w:val="ListParagraph"/>
-        <w:numPr>
-          <w:ilvl w:val="0"/>
-          <w:numId w:val="2"/>
-        </w:numPr>
-        <w:spacing w:after="60"/>
-      </w:pPr>
-      <w:r>
-        <w:rPr>
-          <w:rFonts w:ascii="Calibri" w:cs="Calibri" w:eastAsia="Calibri" w:hAnsi="Calibri"/>
-          <w:b/>
-          <w:bCs/>
-        </w:rPr>
-        <w:t xml:space="preserve">Copias de seguridad 3-2-1</w:t>
-      </w:r>
-      <w:r>
-        <w:rPr>
-          <w:rFonts w:ascii="Calibri" w:cs="Calibri" w:eastAsia="Calibri" w:hAnsi="Calibri"/>
-        </w:rPr>
-        <w:t xml:space="preserve">, con una copia fuera de línea o inmutable, y pruebas periódicas de restauración.</w:t>
-      </w:r>
-    </w:p>
-    <w:p>
-      <w:pPr>
-        <w:pStyle w:val="ListParagraph"/>
-        <w:numPr>
-          <w:ilvl w:val="0"/>
-          <w:numId w:val="2"/>
-        </w:numPr>
-        <w:spacing w:after="60"/>
-      </w:pPr>
-      <w:r>
-        <w:rPr>
-          <w:rFonts w:ascii="Calibri" w:cs="Calibri" w:eastAsia="Calibri" w:hAnsi="Calibri"/>
-          <w:b/>
-          <w:bCs/>
-        </w:rPr>
-        <w:t xml:space="preserve">Principio de privilegio mínimo</w:t>
-      </w:r>
-      <w:r>
-        <w:rPr>
-          <w:rFonts w:ascii="Calibri" w:cs="Calibri" w:eastAsia="Calibri" w:hAnsi="Calibri"/>
-        </w:rPr>
-        <w:t xml:space="preserve"> y política de contraseñas.</w:t>
-      </w:r>
-    </w:p>
-    <w:p>
-      <w:pPr>
-        <w:pStyle w:val="ListParagraph"/>
-        <w:numPr>
-          <w:ilvl w:val="0"/>
-          <w:numId w:val="2"/>
-        </w:numPr>
-        <w:spacing w:after="60"/>
-      </w:pPr>
-      <w:r>
-        <w:rPr>
-          <w:rFonts w:ascii="Calibri" w:cs="Calibri" w:eastAsia="Calibri" w:hAnsi="Calibri"/>
-          <w:b/>
-          <w:bCs/>
-        </w:rPr>
-        <w:t xml:space="preserve">Desactivar macros</w:t>
-      </w:r>
-      <w:r>
-        <w:rPr>
-          <w:rFonts w:ascii="Calibri" w:cs="Calibri" w:eastAsia="Calibri" w:hAnsi="Calibri"/>
-        </w:rPr>
-        <w:t xml:space="preserve"> por defecto.</w:t>
-      </w:r>
-    </w:p>
-    <w:p>
-      <w:pPr>
-        <w:pStyle w:val="ListParagraph"/>
-        <w:numPr>
-          <w:ilvl w:val="0"/>
-          <w:numId w:val="2"/>
-        </w:numPr>
-        <w:spacing w:after="60"/>
-      </w:pPr>
-      <w:r>
-        <w:rPr>
-          <w:rFonts w:ascii="Calibri" w:cs="Calibri" w:eastAsia="Calibri" w:hAnsi="Calibri"/>
-          <w:b/>
-          <w:bCs/>
-        </w:rPr>
-        <w:t xml:space="preserve">SIEM y registros centralizados</w:t>
-      </w:r>
-      <w:r>
-        <w:rPr>
-          <w:rFonts w:ascii="Calibri" w:cs="Calibri" w:eastAsia="Calibri" w:hAnsi="Calibri"/>
-        </w:rPr>
-        <w:t xml:space="preserve"> para detectar actividad sospechosa a tiempo.</w:t>
-      </w:r>
-    </w:p>
-    <w:p>
-      <w:pPr>
-        <w:pStyle w:val="ListParagraph"/>
-        <w:numPr>
-          <w:ilvl w:val="0"/>
-          <w:numId w:val="2"/>
-        </w:numPr>
-        <w:spacing w:after="60"/>
-      </w:pPr>
-      <w:r>
-        <w:rPr>
-          <w:rFonts w:ascii="Calibri" w:cs="Calibri" w:eastAsia="Calibri" w:hAnsi="Calibri"/>
-          <w:b/>
-          <w:bCs/>
-        </w:rPr>
-        <w:t xml:space="preserve">Plan de continuidad del negocio y de recuperación ante desastres</w:t>
-      </w:r>
-      <w:r>
-        <w:rPr>
-          <w:rFonts w:ascii="Calibri" w:cs="Calibri" w:eastAsia="Calibri" w:hAnsi="Calibri"/>
-        </w:rPr>
-        <w:t xml:space="preserve"> (con BIA, RTO y RPO definidos).</w:t>
-      </w:r>
-    </w:p>
-    <w:p>
-      <w:pPr>
-        <w:pStyle w:val="ListParagraph"/>
-        <w:numPr>
-          <w:ilvl w:val="0"/>
-          <w:numId w:val="2"/>
-        </w:numPr>
-        <w:spacing w:after="60"/>
-      </w:pPr>
-      <w:r>
-        <w:rPr>
-          <w:rFonts w:ascii="Calibri" w:cs="Calibri" w:eastAsia="Calibri" w:hAnsi="Calibri"/>
-          <w:b/>
-          <w:bCs/>
-        </w:rPr>
-        <w:t xml:space="preserve">Modelo Zero Trust</w:t>
-      </w:r>
-      <w:r>
-        <w:rPr>
-          <w:rFonts w:ascii="Calibri" w:cs="Calibri" w:eastAsia="Calibri" w:hAnsi="Calibri"/>
-        </w:rPr>
-        <w:t xml:space="preserve">: nunca confiar, siempre verificar.</w:t>
-      </w:r>
-    </w:p>
-    <w:p>
-      <w:pPr>
-        <w:pStyle w:val="ListParagraph"/>
-        <w:numPr>
-          <w:ilvl w:val="0"/>
-          <w:numId w:val="2"/>
-        </w:numPr>
-        <w:spacing w:after="60"/>
-      </w:pPr>
-      <w:r>
-        <w:rPr>
-          <w:rFonts w:ascii="Calibri" w:cs="Calibri" w:eastAsia="Calibri" w:hAnsi="Calibri"/>
-          <w:b/>
-          <w:bCs/>
-        </w:rPr>
-        <w:t xml:space="preserve">Seguro de ciberriesgo.</w:t>
+        <w:spacing w:after="100"/>
+      </w:pPr>
+      <w:r>
+        <w:rPr>
+          <w:rFonts w:ascii="Calibri" w:cs="Calibri" w:eastAsia="Calibri" w:hAnsi="Calibri"/>
+        </w:rPr>
+        <w:t xml:space="preserve">Las medidas van en la dirección correcta, pero no cubren todo. Los controles que siguen pendientes se incluyen en las recomendaciones.</w:t>
       </w:r>
     </w:p>
     <w:p>
@@ -4460,7 +4013,7 @@
               <w:rPr>
                 <w:rFonts w:ascii="Calibri" w:cs="Calibri" w:eastAsia="Calibri" w:hAnsi="Calibri"/>
               </w:rPr>
-              <w:t xml:space="preserve">Crear el CSIRT con TI, Legal, Recursos Humanos, Relaciones Públicas, Gerencia y Continuidad del negocio. Definir roles, herramientas, inventario de activos, copias de seguridad probadas y contactos externos</w:t>
+              <w:t xml:space="preserve">Crear el CSIRT con representantes de TI, Legal, Recursos Humanos, Relaciones Públicas, Gerencia y Continuidad del negocio. Definir roles, herramientas, inventario de activos, copias de seguridad probadas y contactos externos</w:t>
             </w:r>
           </w:p>
         </w:tc>
@@ -4516,7 +4069,7 @@
               <w:rPr>
                 <w:rFonts w:ascii="Calibri" w:cs="Calibri" w:eastAsia="Calibri" w:hAnsi="Calibri"/>
               </w:rPr>
-              <w:t xml:space="preserve">Detectar con EDR y SIEM. Confirmar el incidente (descartar falsos positivos), determinar el alcance (qué equipos y datos), clasificar y priorizar, y notificar a las partes interesadas</w:t>
+              <w:t xml:space="preserve">Detectar con el EDR y un SIEM, confirmar que se trata de un incidente real, determinar su alcance, clasificarlo, priorizarlo y notificar a las partes interesadas</w:t>
             </w:r>
           </w:p>
         </w:tc>
@@ -4571,44 +4124,8 @@
             <w:r>
               <w:rPr>
                 <w:rFonts w:ascii="Calibri" w:cs="Calibri" w:eastAsia="Calibri" w:hAnsi="Calibri"/>
-                <w:b/>
-                <w:bCs/>
-              </w:rPr>
-              <w:t xml:space="preserve">Contención:</w:t>
-            </w:r>
-            <w:r>
-              <w:rPr>
-                <w:rFonts w:ascii="Calibri" w:cs="Calibri" w:eastAsia="Calibri" w:hAnsi="Calibri"/>
-              </w:rPr>
-              <w:t xml:space="preserve"> aislar de inmediato los equipos infectados y desconectar el servidor afectado de la red. </w:t>
-            </w:r>
-            <w:r>
-              <w:rPr>
-                <w:rFonts w:ascii="Calibri" w:cs="Calibri" w:eastAsia="Calibri" w:hAnsi="Calibri"/>
-                <w:b/>
-                <w:bCs/>
-              </w:rPr>
-              <w:t xml:space="preserve">Erradicación:</w:t>
-            </w:r>
-            <w:r>
-              <w:rPr>
-                <w:rFonts w:ascii="Calibri" w:cs="Calibri" w:eastAsia="Calibri" w:hAnsi="Calibri"/>
-              </w:rPr>
-              <w:t xml:space="preserve"> eliminar el malware, identificar todos los hosts que necesitan corrección, cambiar credenciales y parchear. </w:t>
-            </w:r>
-            <w:r>
-              <w:rPr>
-                <w:rFonts w:ascii="Calibri" w:cs="Calibri" w:eastAsia="Calibri" w:hAnsi="Calibri"/>
-                <w:b/>
-                <w:bCs/>
-              </w:rPr>
-              <w:t xml:space="preserve">Recuperación:</w:t>
-            </w:r>
-            <w:r>
-              <w:rPr>
-                <w:rFonts w:ascii="Calibri" w:cs="Calibri" w:eastAsia="Calibri" w:hAnsi="Calibri"/>
-              </w:rPr>
-              <w:t xml:space="preserve"> restaurar desde copias limpias y verificar antes de reconectar</w:t>
+              </w:rPr>
+              <w:t xml:space="preserve">Aislar de inmediato los equipos infectados y desconectar el servidor afectado. Luego eliminar el malware, identificar todos los hosts que necesitan corrección, cambiar credenciales y parchear. Por último, restaurar desde copias limpias y verificar antes de reconectar</w:t>
             </w:r>
           </w:p>
         </w:tc>
@@ -4664,7 +4181,7 @@
               <w:rPr>
                 <w:rFonts w:ascii="Calibri" w:cs="Calibri" w:eastAsia="Calibri" w:hAnsi="Calibri"/>
               </w:rPr>
-              <w:t xml:space="preserve">Informar y revisar qué falló, aplicar las lecciones aprendidas, actualizar controles y políticas</w:t>
+              <w:t xml:space="preserve">Revisar qué falló, aplicar las lecciones aprendidas y actualizar controles y políticas</w:t>
             </w:r>
           </w:p>
         </w:tc>
@@ -4685,23 +4202,18 @@
           <w:b/>
           <w:bCs/>
         </w:rPr>
-        <w:t xml:space="preserve">Manejo de la evidencia (forense digital)</w:t>
+        <w:t xml:space="preserve">Manejo de la evidencia</w:t>
       </w:r>
     </w:p>
     <w:p>
       <w:pPr>
-        <w:pStyle w:val="ListParagraph"/>
-        <w:numPr>
-          <w:ilvl w:val="0"/>
-          <w:numId w:val="2"/>
-        </w:numPr>
-        <w:spacing w:after="60"/>
-      </w:pPr>
-      <w:r>
-        <w:rPr>
-          <w:rFonts w:ascii="Calibri" w:cs="Calibri" w:eastAsia="Calibri" w:hAnsi="Calibri"/>
-        </w:rPr>
-        <w:t xml:space="preserve">Conservar los </w:t>
+        <w:spacing w:after="100"/>
+      </w:pPr>
+      <w:r>
+        <w:rPr>
+          <w:rFonts w:ascii="Calibri" w:cs="Calibri" w:eastAsia="Calibri" w:hAnsi="Calibri"/>
+        </w:rPr>
+        <w:t xml:space="preserve">Hay que conservar los </w:t>
       </w:r>
       <w:r>
         <w:rPr>
@@ -4715,183 +4227,72 @@
         <w:rPr>
           <w:rFonts w:ascii="Calibri" w:cs="Calibri" w:eastAsia="Calibri" w:hAnsi="Calibri"/>
         </w:rPr>
-        <w:t xml:space="preserve"> (correo, PDF, registros, conexión al servidor remoto) para análisis y atribución.</w:t>
+        <w:t xml:space="preserve"> (el correo, el PDF, los registros y la conexión al servidor remoto) para el análisis y la atribución. Se debe seguir el </w:t>
+      </w:r>
+      <w:r>
+        <w:rPr>
+          <w:rFonts w:ascii="Calibri" w:cs="Calibri" w:eastAsia="Calibri" w:hAnsi="Calibri"/>
+          <w:b/>
+          <w:bCs/>
+        </w:rPr>
+        <w:t xml:space="preserve">orden de volatilidad</w:t>
+      </w:r>
+      <w:r>
+        <w:rPr>
+          <w:rFonts w:ascii="Calibri" w:cs="Calibri" w:eastAsia="Calibri" w:hAnsi="Calibri"/>
+        </w:rPr>
+        <w:t xml:space="preserve"> (RFC 3227), recolectando primero los datos que se pierden más rápido, como la memoria, y mantener la </w:t>
+      </w:r>
+      <w:r>
+        <w:rPr>
+          <w:rFonts w:ascii="Calibri" w:cs="Calibri" w:eastAsia="Calibri" w:hAnsi="Calibri"/>
+          <w:b/>
+          <w:bCs/>
+        </w:rPr>
+        <w:t xml:space="preserve">cadena de custodia</w:t>
+      </w:r>
+      <w:r>
+        <w:rPr>
+          <w:rFonts w:ascii="Calibri" w:cs="Calibri" w:eastAsia="Calibri" w:hAnsi="Calibri"/>
+        </w:rPr>
+        <w:t xml:space="preserve">. El proceso forense comprende recolección, examen, análisis y presentación de informes.</w:t>
       </w:r>
     </w:p>
     <w:p>
       <w:pPr>
-        <w:pStyle w:val="ListParagraph"/>
-        <w:numPr>
-          <w:ilvl w:val="0"/>
-          <w:numId w:val="2"/>
-        </w:numPr>
-        <w:spacing w:after="60"/>
-      </w:pPr>
-      <w:r>
-        <w:rPr>
-          <w:rFonts w:ascii="Calibri" w:cs="Calibri" w:eastAsia="Calibri" w:hAnsi="Calibri"/>
-        </w:rPr>
-        <w:t xml:space="preserve">Seguir el </w:t>
-      </w:r>
+        <w:spacing w:after="80" w:before="160"/>
+      </w:pPr>
       <w:r>
         <w:rPr>
           <w:rFonts w:ascii="Calibri" w:cs="Calibri" w:eastAsia="Calibri" w:hAnsi="Calibri"/>
           <w:b/>
           <w:bCs/>
         </w:rPr>
-        <w:t xml:space="preserve">orden de volatilidad</w:t>
-      </w:r>
-      <w:r>
-        <w:rPr>
-          <w:rFonts w:ascii="Calibri" w:cs="Calibri" w:eastAsia="Calibri" w:hAnsi="Calibri"/>
-        </w:rPr>
-        <w:t xml:space="preserve"> (RFC 3227): primero los datos que se pierden más rápido, como la memoria.</w:t>
+        <w:t xml:space="preserve">Comunicación</w:t>
       </w:r>
     </w:p>
     <w:p>
       <w:pPr>
-        <w:pStyle w:val="ListParagraph"/>
-        <w:numPr>
-          <w:ilvl w:val="0"/>
-          <w:numId w:val="2"/>
-        </w:numPr>
-        <w:spacing w:after="60"/>
-      </w:pPr>
-      <w:r>
-        <w:rPr>
-          <w:rFonts w:ascii="Calibri" w:cs="Calibri" w:eastAsia="Calibri" w:hAnsi="Calibri"/>
-        </w:rPr>
-        <w:t xml:space="preserve">Mantener la </w:t>
-      </w:r>
+        <w:spacing w:after="100"/>
+      </w:pPr>
+      <w:r>
+        <w:rPr>
+          <w:rFonts w:ascii="Calibri" w:cs="Calibri" w:eastAsia="Calibri" w:hAnsi="Calibri"/>
+        </w:rPr>
+        <w:t xml:space="preserve">El equipo legal debe revisar si existe obligación de notificar a los clientes y a las autoridades, dado que se vieron afectadas las bases de datos de clientes. Un mensaje claro a los clientes ayuda a limitar el daño reputacional.</w:t>
+      </w:r>
+    </w:p>
+    <w:p>
+      <w:pPr>
+        <w:spacing w:after="120" w:before="280"/>
+      </w:pPr>
       <w:r>
         <w:rPr>
           <w:rFonts w:ascii="Calibri" w:cs="Calibri" w:eastAsia="Calibri" w:hAnsi="Calibri"/>
           <w:b/>
           <w:bCs/>
         </w:rPr>
-        <w:t xml:space="preserve">cadena de custodia</w:t>
-      </w:r>
-      <w:r>
-        <w:rPr>
-          <w:rFonts w:ascii="Calibri" w:cs="Calibri" w:eastAsia="Calibri" w:hAnsi="Calibri"/>
-        </w:rPr>
-        <w:t xml:space="preserve">.</w:t>
-      </w:r>
-    </w:p>
-    <w:p>
-      <w:pPr>
-        <w:pStyle w:val="ListParagraph"/>
-        <w:numPr>
-          <w:ilvl w:val="0"/>
-          <w:numId w:val="2"/>
-        </w:numPr>
-        <w:spacing w:after="60"/>
-      </w:pPr>
-      <w:r>
-        <w:rPr>
-          <w:rFonts w:ascii="Calibri" w:cs="Calibri" w:eastAsia="Calibri" w:hAnsi="Calibri"/>
-        </w:rPr>
-        <w:t xml:space="preserve">Pasos del proceso forense: </w:t>
-      </w:r>
-      <w:r>
-        <w:rPr>
-          <w:rFonts w:ascii="Calibri" w:cs="Calibri" w:eastAsia="Calibri" w:hAnsi="Calibri"/>
-          <w:b/>
-          <w:bCs/>
-        </w:rPr>
-        <w:t xml:space="preserve">recolección, examen, análisis y presentación de informes</w:t>
-      </w:r>
-      <w:r>
-        <w:rPr>
-          <w:rFonts w:ascii="Calibri" w:cs="Calibri" w:eastAsia="Calibri" w:hAnsi="Calibri"/>
-        </w:rPr>
-        <w:t xml:space="preserve">.</w:t>
-      </w:r>
-    </w:p>
-    <w:p>
-      <w:pPr>
-        <w:spacing w:after="80" w:before="160"/>
-      </w:pPr>
-      <w:r>
-        <w:rPr>
-          <w:rFonts w:ascii="Calibri" w:cs="Calibri" w:eastAsia="Calibri" w:hAnsi="Calibri"/>
-          <w:b/>
-          <w:bCs/>
-        </w:rPr>
-        <w:t xml:space="preserve">Comunicación</w:t>
-      </w:r>
-    </w:p>
-    <w:p>
-      <w:pPr>
-        <w:pStyle w:val="ListParagraph"/>
-        <w:numPr>
-          <w:ilvl w:val="0"/>
-          <w:numId w:val="2"/>
-        </w:numPr>
-        <w:spacing w:after="60"/>
-      </w:pPr>
-      <w:r>
-        <w:rPr>
-          <w:rFonts w:ascii="Calibri" w:cs="Calibri" w:eastAsia="Calibri" w:hAnsi="Calibri"/>
-        </w:rPr>
-        <w:t xml:space="preserve">El equipo </w:t>
-      </w:r>
-      <w:r>
-        <w:rPr>
-          <w:rFonts w:ascii="Calibri" w:cs="Calibri" w:eastAsia="Calibri" w:hAnsi="Calibri"/>
-          <w:b/>
-          <w:bCs/>
-        </w:rPr>
-        <w:t xml:space="preserve">legal</w:t>
-      </w:r>
-      <w:r>
-        <w:rPr>
-          <w:rFonts w:ascii="Calibri" w:cs="Calibri" w:eastAsia="Calibri" w:hAnsi="Calibri"/>
-        </w:rPr>
-        <w:t xml:space="preserve"> debe revisar si hay obligación de notificar a clientes y autoridades por las bases de datos de clientes.</w:t>
-      </w:r>
-    </w:p>
-    <w:p>
-      <w:pPr>
-        <w:pStyle w:val="ListParagraph"/>
-        <w:numPr>
-          <w:ilvl w:val="0"/>
-          <w:numId w:val="2"/>
-        </w:numPr>
-        <w:spacing w:after="60"/>
-      </w:pPr>
-      <w:r>
-        <w:rPr>
-          <w:rFonts w:ascii="Calibri" w:cs="Calibri" w:eastAsia="Calibri" w:hAnsi="Calibri"/>
-        </w:rPr>
-        <w:t xml:space="preserve">Dar un mensaje claro a los clientes ayuda a limitar el </w:t>
-      </w:r>
-      <w:r>
-        <w:rPr>
-          <w:rFonts w:ascii="Calibri" w:cs="Calibri" w:eastAsia="Calibri" w:hAnsi="Calibri"/>
-          <w:b/>
-          <w:bCs/>
-        </w:rPr>
-        <w:t xml:space="preserve">daño reputacional</w:t>
-      </w:r>
-      <w:r>
-        <w:rPr>
-          <w:rFonts w:ascii="Calibri" w:cs="Calibri" w:eastAsia="Calibri" w:hAnsi="Calibri"/>
-        </w:rPr>
-        <w:t xml:space="preserve">.</w:t>
-      </w:r>
-    </w:p>
-    <w:p>
-      <w:pPr>
-        <w:spacing w:after="120" w:before="280"/>
-      </w:pPr>
-      <w:r>
-        <w:rPr>
-          <w:rFonts w:ascii="Calibri" w:cs="Calibri" w:eastAsia="Calibri" w:hAnsi="Calibri"/>
-          <w:b/>
-          <w:bCs/>
-        </w:rPr>
-        <w:t xml:space="preserve">7. Recomendaciones priorizadas</w:t>
+        <w:t xml:space="preserve">7. Recomendaciones</w:t>
       </w:r>
     </w:p>
     <w:tbl>
@@ -5024,7 +4425,7 @@
               <w:rPr>
                 <w:rFonts w:ascii="Calibri" w:cs="Calibri" w:eastAsia="Calibri" w:hAnsi="Calibri"/>
               </w:rPr>
-              <w:t xml:space="preserve">Actualizar antivirus y parches, activar filtro de correo, desactivar macros, backups completos y fuera de línea, política de contraseñas, simulacros de phishing, y probar el plan de respuesta con un ejercicio de mesa</w:t>
+              <w:t xml:space="preserve">Actualizar el antivirus y los parches, activar un filtro de correo, desactivar las macros, hacer copias de seguridad completas y fuera de línea (con pruebas de restauración), establecer una política de contraseñas, hacer simulacros de phishing y probar el plan de respuesta con un ejercicio de mesa</w:t>
             </w:r>
           </w:p>
         </w:tc>
@@ -5080,7 +4481,7 @@
               <w:rPr>
                 <w:rFonts w:ascii="Calibri" w:cs="Calibri" w:eastAsia="Calibri" w:hAnsi="Calibri"/>
               </w:rPr>
-              <w:t xml:space="preserve">Segmentación de red (VLAN y DMZ), SIEM con registros centralizados, privilegio mínimo, plan de continuidad del negocio y recuperación ante desastres, y seguro de ciberriesgo</w:t>
+              <w:t xml:space="preserve">Segmentar la red (VLAN y DMZ), implementar un SIEM con registros centralizados, aplicar el principio de privilegio mínimo, elaborar un plan de continuidad del negocio y de recuperación ante desastres (con BIA, RTO y RPO definidos) y contratar un seguro de ciberriesgo</w:t>
             </w:r>
           </w:p>
         </w:tc>
@@ -5136,7 +4537,7 @@
               <w:rPr>
                 <w:rFonts w:ascii="Calibri" w:cs="Calibri" w:eastAsia="Calibri" w:hAnsi="Calibri"/>
               </w:rPr>
-              <w:t xml:space="preserve">Modelo Zero Trust, auditorías periódicas, pruebas de penetración, gobernanza de ciberseguridad con políticas formales (por ejemplo, alineación con ISO 27000) e inteligencia de amenazas</w:t>
+              <w:t xml:space="preserve">Adoptar el modelo Zero Trust, realizar auditorías y pruebas de penetración periódicas, establecer una gobernanza de ciberseguridad con políticas formales (por ejemplo, alineada con ISO 27000) e incorporar inteligencia de amenazas</w:t>
             </w:r>
           </w:p>
         </w:tc>
@@ -5157,127 +4558,18 @@
           <w:b/>
           <w:bCs/>
         </w:rPr>
-        <w:t xml:space="preserve">8. Lecciones aprendidas y conclusión</w:t>
+        <w:t xml:space="preserve">8. Conclusión</w:t>
       </w:r>
     </w:p>
     <w:p>
       <w:pPr>
-        <w:pStyle w:val="ListParagraph"/>
-        <w:numPr>
-          <w:ilvl w:val="0"/>
-          <w:numId w:val="2"/>
-        </w:numPr>
-        <w:spacing w:after="60"/>
-      </w:pPr>
-      <w:r>
-        <w:rPr>
-          <w:rFonts w:ascii="Calibri" w:cs="Calibri" w:eastAsia="Calibri" w:hAnsi="Calibri"/>
-        </w:rPr>
-        <w:t xml:space="preserve">El ataque </w:t>
-      </w:r>
-      <w:r>
-        <w:rPr>
-          <w:rFonts w:ascii="Calibri" w:cs="Calibri" w:eastAsia="Calibri" w:hAnsi="Calibri"/>
-          <w:b/>
-          <w:bCs/>
-        </w:rPr>
-        <w:t xml:space="preserve">no fue solo un fallo técnico</w:t>
-      </w:r>
-      <w:r>
-        <w:rPr>
-          <w:rFonts w:ascii="Calibri" w:cs="Calibri" w:eastAsia="Calibri" w:hAnsi="Calibri"/>
-        </w:rPr>
-        <w:t xml:space="preserve">: combinó un error humano con falta de controles básicos y de gobernanza.</w:t>
-      </w:r>
-    </w:p>
-    <w:p>
-      <w:pPr>
-        <w:pStyle w:val="ListParagraph"/>
-        <w:numPr>
-          <w:ilvl w:val="0"/>
-          <w:numId w:val="2"/>
-        </w:numPr>
-        <w:spacing w:after="60"/>
-      </w:pPr>
-      <w:r>
-        <w:rPr>
-          <w:rFonts w:ascii="Calibri" w:cs="Calibri" w:eastAsia="Calibri" w:hAnsi="Calibri"/>
-        </w:rPr>
-        <w:t xml:space="preserve">Crecer rápido </w:t>
-      </w:r>
-      <w:r>
-        <w:rPr>
-          <w:rFonts w:ascii="Calibri" w:cs="Calibri" w:eastAsia="Calibri" w:hAnsi="Calibri"/>
-          <w:b/>
-          <w:bCs/>
-        </w:rPr>
-        <w:t xml:space="preserve">sin seguridad</w:t>
-      </w:r>
-      <w:r>
-        <w:rPr>
-          <w:rFonts w:ascii="Calibri" w:cs="Calibri" w:eastAsia="Calibri" w:hAnsi="Calibri"/>
-        </w:rPr>
-        <w:t xml:space="preserve"> deja riesgos acumulados. La seguridad debe crecer al mismo ritmo que la infraestructura.</w:t>
-      </w:r>
-    </w:p>
-    <w:p>
-      <w:pPr>
-        <w:pStyle w:val="ListParagraph"/>
-        <w:numPr>
-          <w:ilvl w:val="0"/>
-          <w:numId w:val="2"/>
-        </w:numPr>
-        <w:spacing w:after="60"/>
-      </w:pPr>
-      <w:r>
-        <w:rPr>
-          <w:rFonts w:ascii="Calibri" w:cs="Calibri" w:eastAsia="Calibri" w:hAnsi="Calibri"/>
-        </w:rPr>
-        <w:t xml:space="preserve">Las medidas implementadas </w:t>
-      </w:r>
-      <w:r>
-        <w:rPr>
-          <w:rFonts w:ascii="Calibri" w:cs="Calibri" w:eastAsia="Calibri" w:hAnsi="Calibri"/>
-          <w:b/>
-          <w:bCs/>
-        </w:rPr>
-        <w:t xml:space="preserve">van en la dirección correcta</w:t>
-      </w:r>
-      <w:r>
-        <w:rPr>
-          <w:rFonts w:ascii="Calibri" w:cs="Calibri" w:eastAsia="Calibri" w:hAnsi="Calibri"/>
-        </w:rPr>
-        <w:t xml:space="preserve">, pero el riesgo no desaparece: hay que cerrar las brechas pendientes (segmentación, backups, filtro de correo, parches) y mantener todo con revisión continua.</w:t>
-      </w:r>
-    </w:p>
-    <w:p>
-      <w:pPr>
-        <w:pStyle w:val="ListParagraph"/>
-        <w:numPr>
-          <w:ilvl w:val="0"/>
-          <w:numId w:val="2"/>
-        </w:numPr>
-        <w:spacing w:after="60"/>
-      </w:pPr>
-      <w:r>
-        <w:rPr>
-          <w:rFonts w:ascii="Calibri" w:cs="Calibri" w:eastAsia="Calibri" w:hAnsi="Calibri"/>
-        </w:rPr>
-        <w:t xml:space="preserve">Una organización preparada </w:t>
-      </w:r>
-      <w:r>
-        <w:rPr>
-          <w:rFonts w:ascii="Calibri" w:cs="Calibri" w:eastAsia="Calibri" w:hAnsi="Calibri"/>
-          <w:b/>
-          <w:bCs/>
-        </w:rPr>
-        <w:t xml:space="preserve">limita el impacto</w:t>
-      </w:r>
-      <w:r>
-        <w:rPr>
-          <w:rFonts w:ascii="Calibri" w:cs="Calibri" w:eastAsia="Calibri" w:hAnsi="Calibri"/>
-        </w:rPr>
-        <w:t xml:space="preserve">: con backups sólidos y un plan de respuesta probado, el ataque habría costado mucho menos que 75 000 USD y no habría parado la operación cinco días.</w:t>
+        <w:spacing w:after="100"/>
+      </w:pPr>
+      <w:r>
+        <w:rPr>
+          <w:rFonts w:ascii="Calibri" w:cs="Calibri" w:eastAsia="Calibri" w:hAnsi="Calibri"/>
+        </w:rPr>
+        <w:t xml:space="preserve">El caso de TechNova muestra que crecer rápido sin seguridad acumula riesgos: la protección debe crecer al mismo ritmo que la infraestructura. Las medidas implementadas reducen el riesgo, pero no lo eliminan, por lo que hay que cerrar las brechas pendientes y mantener una revisión continua. Con copias de seguridad sólidas y un plan de respuesta probado, el incidente habría costado mucho menos que 75 000 USD y no habría paralizado la operación durante cinco días.</w:t>
       </w:r>
     </w:p>
     <w:sectPr>

</xml_diff>